<commit_message>
Complete inverse and solid surface formulas
Co-authored-by: arena-agent <297053741+arena-agent@users.noreply.github.com>
</commit_message>
<xml_diff>
--- a/manuel-math-t5/PROTOTYPE_ANNEXE_2_FORMULES.docx
+++ b/manuel-math-t5/PROTOTYPE_ANNEXE_2_FORMULES.docx
@@ -213,7 +213,7 @@
           <w:p>
             <w:pPr>
               <w:shd w:fill="EEF4F8" w:val="clear"/>
-              <w:spacing w:after="55" w:before="0" w:line="285"/>
+              <w:spacing w:after="3" w:before="0" w:line="285"/>
               <w:jc w:val="left"/>
             </w:pPr>
             <w:r>
@@ -237,10 +237,43 @@
                 <w:i w:val="false"/>
                 <w:iCs w:val="false"/>
                 <w:color w:val="A61C00"/>
-                <w:sz w:val="26"/>
-                <w:szCs w:val="26"/>
+                <w:sz w:val="24"/>
+                <w:szCs w:val="24"/>
               </w:rPr>
               <w:t xml:space="preserve">P = 4 × c ;   A = c × c</w:t>
+            </w:r>
+          </w:p>
+          <w:p>
+            <w:pPr>
+              <w:shd w:fill="EEF4F8" w:val="clear"/>
+              <w:spacing w:after="3" w:before="0" w:line="285"/>
+              <w:jc w:val="left"/>
+            </w:pPr>
+            <w:r>
+              <w:rPr>
+                <w:rFonts w:ascii="Times New Roman" w:cs="Times New Roman" w:eastAsia="Times New Roman" w:hAnsi="Times New Roman"/>
+                <w:b/>
+                <w:bCs/>
+                <w:i w:val="false"/>
+                <w:iCs w:val="false"/>
+                <w:color w:val="1F4E79"/>
+                <w:sz w:val="23"/>
+                <w:szCs w:val="23"/>
+              </w:rPr>
+              <w:t xml:space="preserve">                 </w:t>
+            </w:r>
+            <w:r>
+              <w:rPr>
+                <w:rFonts w:ascii="Times New Roman" w:cs="Times New Roman" w:eastAsia="Times New Roman" w:hAnsi="Times New Roman"/>
+                <w:b/>
+                <w:bCs/>
+                <w:i w:val="false"/>
+                <w:iCs w:val="false"/>
+                <w:color w:val="A61C00"/>
+                <w:sz w:val="24"/>
+                <w:szCs w:val="24"/>
+              </w:rPr>
+              <w:t xml:space="preserve">c = P ÷ 4</w:t>
             </w:r>
           </w:p>
           <w:p>
@@ -306,7 +339,7 @@
                 <w:sz w:val="23"/>
                 <w:szCs w:val="23"/>
               </w:rPr>
-              <w:t xml:space="preserve">Si c = 5 cm : P = 4 × 5 = 20 cm ; A = 5 × 5 = 25 cm².</w:t>
+              <w:t xml:space="preserve">Si c = 5 cm : P = 20 cm ; A = 25 cm². Si P = 20 cm : c = 20 ÷ 4 = 5 cm.</w:t>
             </w:r>
           </w:p>
           <w:p>
@@ -326,7 +359,7 @@
                 <w:sz w:val="19"/>
                 <w:szCs w:val="19"/>
               </w:rPr>
-              <w:t xml:space="preserve">Pour retrouver le côté : c = P ÷ 4.</w:t>
+              <w:t xml:space="preserve">Le côté c se retrouve avec le périmètre : c = P ÷ 4.</w:t>
             </w:r>
           </w:p>
         </w:tc>
@@ -452,7 +485,7 @@
           <w:p>
             <w:pPr>
               <w:shd w:fill="EEF4F8" w:val="clear"/>
-              <w:spacing w:after="55" w:before="0" w:line="285"/>
+              <w:spacing w:after="3" w:before="0" w:line="285"/>
               <w:jc w:val="left"/>
             </w:pPr>
             <w:r>
@@ -476,10 +509,76 @@
                 <w:i w:val="false"/>
                 <w:iCs w:val="false"/>
                 <w:color w:val="A61C00"/>
-                <w:sz w:val="26"/>
-                <w:szCs w:val="26"/>
+                <w:sz w:val="24"/>
+                <w:szCs w:val="24"/>
               </w:rPr>
               <w:t xml:space="preserve">P = 2 × (L + l) ;   A = L × l</w:t>
+            </w:r>
+          </w:p>
+          <w:p>
+            <w:pPr>
+              <w:shd w:fill="EEF4F8" w:val="clear"/>
+              <w:spacing w:after="3" w:before="0" w:line="285"/>
+              <w:jc w:val="left"/>
+            </w:pPr>
+            <w:r>
+              <w:rPr>
+                <w:rFonts w:ascii="Times New Roman" w:cs="Times New Roman" w:eastAsia="Times New Roman" w:hAnsi="Times New Roman"/>
+                <w:b/>
+                <w:bCs/>
+                <w:i w:val="false"/>
+                <w:iCs w:val="false"/>
+                <w:color w:val="1F4E79"/>
+                <w:sz w:val="23"/>
+                <w:szCs w:val="23"/>
+              </w:rPr>
+              <w:t xml:space="preserve">                 </w:t>
+            </w:r>
+            <w:r>
+              <w:rPr>
+                <w:rFonts w:ascii="Times New Roman" w:cs="Times New Roman" w:eastAsia="Times New Roman" w:hAnsi="Times New Roman"/>
+                <w:b/>
+                <w:bCs/>
+                <w:i w:val="false"/>
+                <w:iCs w:val="false"/>
+                <w:color w:val="A61C00"/>
+                <w:sz w:val="24"/>
+                <w:szCs w:val="24"/>
+              </w:rPr>
+              <w:t xml:space="preserve">L = A ÷ l ;   l = A ÷ L</w:t>
+            </w:r>
+          </w:p>
+          <w:p>
+            <w:pPr>
+              <w:shd w:fill="EEF4F8" w:val="clear"/>
+              <w:spacing w:after="3" w:before="0" w:line="285"/>
+              <w:jc w:val="left"/>
+            </w:pPr>
+            <w:r>
+              <w:rPr>
+                <w:rFonts w:ascii="Times New Roman" w:cs="Times New Roman" w:eastAsia="Times New Roman" w:hAnsi="Times New Roman"/>
+                <w:b/>
+                <w:bCs/>
+                <w:i w:val="false"/>
+                <w:iCs w:val="false"/>
+                <w:color w:val="1F4E79"/>
+                <w:sz w:val="23"/>
+                <w:szCs w:val="23"/>
+              </w:rPr>
+              <w:t xml:space="preserve">                 </w:t>
+            </w:r>
+            <w:r>
+              <w:rPr>
+                <w:rFonts w:ascii="Times New Roman" w:cs="Times New Roman" w:eastAsia="Times New Roman" w:hAnsi="Times New Roman"/>
+                <w:b/>
+                <w:bCs/>
+                <w:i w:val="false"/>
+                <w:iCs w:val="false"/>
+                <w:color w:val="A61C00"/>
+                <w:sz w:val="24"/>
+                <w:szCs w:val="24"/>
+              </w:rPr>
+              <w:t xml:space="preserve">L = P ÷ 2 − l ;   l = P ÷ 2 − L</w:t>
             </w:r>
           </w:p>
           <w:p>
@@ -545,7 +644,7 @@
                 <w:sz w:val="23"/>
                 <w:szCs w:val="23"/>
               </w:rPr>
-              <w:t xml:space="preserve">Si L = 8 cm et l = 3 cm : P = 22 cm ; A = 24 cm².</w:t>
+              <w:t xml:space="preserve">Si L = 8 cm et l = 3 cm : P = 22 cm ; A = 24 cm². Si A = 24 cm² et l = 3 cm : L = 8 cm.</w:t>
             </w:r>
           </w:p>
           <w:p>
@@ -565,7 +664,7 @@
                 <w:sz w:val="19"/>
                 <w:szCs w:val="19"/>
               </w:rPr>
-              <w:t xml:space="preserve">Formules inverses : L = A ÷ l ; l = A ÷ L ; L = P ÷ 2 − l.</w:t>
+              <w:t xml:space="preserve">Les deux formules inverses du périmètre sont à connaître : L = P ÷ 2 − l et l = P ÷ 2 − L.</w:t>
             </w:r>
           </w:p>
         </w:tc>
@@ -696,7 +795,7 @@
           <w:p>
             <w:pPr>
               <w:shd w:fill="EEF4F8" w:val="clear"/>
-              <w:spacing w:after="55" w:before="0" w:line="285"/>
+              <w:spacing w:after="3" w:before="0" w:line="285"/>
               <w:jc w:val="left"/>
             </w:pPr>
             <w:r>
@@ -720,8 +819,8 @@
                 <w:i w:val="false"/>
                 <w:iCs w:val="false"/>
                 <w:color w:val="A61C00"/>
-                <w:sz w:val="26"/>
-                <w:szCs w:val="26"/>
+                <w:sz w:val="24"/>
+                <w:szCs w:val="24"/>
               </w:rPr>
               <w:t xml:space="preserve">P = a + b + c ;   A = (b × h) ÷ 2</w:t>
             </w:r>
@@ -935,7 +1034,7 @@
           <w:p>
             <w:pPr>
               <w:shd w:fill="EEF4F8" w:val="clear"/>
-              <w:spacing w:after="55" w:before="0" w:line="285"/>
+              <w:spacing w:after="3" w:before="0" w:line="285"/>
               <w:jc w:val="left"/>
             </w:pPr>
             <w:r>
@@ -959,8 +1058,8 @@
                 <w:i w:val="false"/>
                 <w:iCs w:val="false"/>
                 <w:color w:val="A61C00"/>
-                <w:sz w:val="26"/>
-                <w:szCs w:val="26"/>
+                <w:sz w:val="24"/>
+                <w:szCs w:val="24"/>
               </w:rPr>
               <w:t xml:space="preserve">P = n × c ;   DP = P ÷ 2</w:t>
             </w:r>
@@ -1212,7 +1311,7 @@
           <w:p>
             <w:pPr>
               <w:shd w:fill="EEF4F8" w:val="clear"/>
-              <w:spacing w:after="55" w:before="0" w:line="285"/>
+              <w:spacing w:after="3" w:before="0" w:line="285"/>
               <w:jc w:val="left"/>
             </w:pPr>
             <w:r>
@@ -1236,8 +1335,8 @@
                 <w:i w:val="false"/>
                 <w:iCs w:val="false"/>
                 <w:color w:val="A61C00"/>
-                <w:sz w:val="26"/>
-                <w:szCs w:val="26"/>
+                <w:sz w:val="24"/>
+                <w:szCs w:val="24"/>
               </w:rPr>
               <w:t xml:space="preserve">d = 2r ; r = d ÷ 2 ; C = πd = 2πr ; A = πr²</w:t>
             </w:r>
@@ -1456,7 +1555,7 @@
           <w:p>
             <w:pPr>
               <w:shd w:fill="EEF4F8" w:val="clear"/>
-              <w:spacing w:after="55" w:before="0" w:line="285"/>
+              <w:spacing w:after="3" w:before="0" w:line="285"/>
               <w:jc w:val="left"/>
             </w:pPr>
             <w:r>
@@ -1480,8 +1579,8 @@
                 <w:i w:val="false"/>
                 <w:iCs w:val="false"/>
                 <w:color w:val="A61C00"/>
-                <w:sz w:val="26"/>
-                <w:szCs w:val="26"/>
+                <w:sz w:val="24"/>
+                <w:szCs w:val="24"/>
               </w:rPr>
               <w:t xml:space="preserve">A = (B + b) × h ÷ 2</w:t>
             </w:r>
@@ -1695,7 +1794,7 @@
           <w:p>
             <w:pPr>
               <w:shd w:fill="EEF4F8" w:val="clear"/>
-              <w:spacing w:after="55" w:before="0" w:line="285"/>
+              <w:spacing w:after="3" w:before="0" w:line="285"/>
               <w:jc w:val="left"/>
             </w:pPr>
             <w:r>
@@ -1719,8 +1818,8 @@
                 <w:i w:val="false"/>
                 <w:iCs w:val="false"/>
                 <w:color w:val="A61C00"/>
-                <w:sz w:val="26"/>
-                <w:szCs w:val="26"/>
+                <w:sz w:val="24"/>
+                <w:szCs w:val="24"/>
               </w:rPr>
               <w:t xml:space="preserve">A = b × h</w:t>
             </w:r>
@@ -1972,7 +2071,7 @@
           <w:p>
             <w:pPr>
               <w:shd w:fill="EEF4F8" w:val="clear"/>
-              <w:spacing w:after="55" w:before="0" w:line="285"/>
+              <w:spacing w:after="3" w:before="0" w:line="285"/>
               <w:jc w:val="left"/>
             </w:pPr>
             <w:r>
@@ -1996,8 +2095,41 @@
                 <w:i w:val="false"/>
                 <w:iCs w:val="false"/>
                 <w:color w:val="A61C00"/>
-                <w:sz w:val="26"/>
-                <w:szCs w:val="26"/>
+                <w:sz w:val="24"/>
+                <w:szCs w:val="24"/>
+              </w:rPr>
+              <w:t xml:space="preserve">A_latérale = 4 × a² ;   A_totale = 6 × a²</w:t>
+            </w:r>
+          </w:p>
+          <w:p>
+            <w:pPr>
+              <w:shd w:fill="EEF4F8" w:val="clear"/>
+              <w:spacing w:after="3" w:before="0" w:line="285"/>
+              <w:jc w:val="left"/>
+            </w:pPr>
+            <w:r>
+              <w:rPr>
+                <w:rFonts w:ascii="Times New Roman" w:cs="Times New Roman" w:eastAsia="Times New Roman" w:hAnsi="Times New Roman"/>
+                <w:b/>
+                <w:bCs/>
+                <w:i w:val="false"/>
+                <w:iCs w:val="false"/>
+                <w:color w:val="1F4E79"/>
+                <w:sz w:val="23"/>
+                <w:szCs w:val="23"/>
+              </w:rPr>
+              <w:t xml:space="preserve">                 </w:t>
+            </w:r>
+            <w:r>
+              <w:rPr>
+                <w:rFonts w:ascii="Times New Roman" w:cs="Times New Roman" w:eastAsia="Times New Roman" w:hAnsi="Times New Roman"/>
+                <w:b/>
+                <w:bCs/>
+                <w:i w:val="false"/>
+                <w:iCs w:val="false"/>
+                <w:color w:val="A61C00"/>
+                <w:sz w:val="24"/>
+                <w:szCs w:val="24"/>
               </w:rPr>
               <w:t xml:space="preserve">V = a × a × a = a³</w:t>
             </w:r>
@@ -2032,7 +2164,7 @@
                 <w:sz w:val="23"/>
                 <w:szCs w:val="23"/>
               </w:rPr>
-              <w:t xml:space="preserve">a en cm ou m ; V en cm³ ou m³.</w:t>
+              <w:t xml:space="preserve">a en cm ou m ; aires en cm² ou m² ; V en cm³ ou m³.</w:t>
             </w:r>
           </w:p>
           <w:p>
@@ -2065,7 +2197,7 @@
                 <w:sz w:val="23"/>
                 <w:szCs w:val="23"/>
               </w:rPr>
-              <w:t xml:space="preserve">Si a = 4 cm : V = 4 × 4 × 4 = 64 cm³.</w:t>
+              <w:t xml:space="preserve">Si a = 4 cm : A_latérale = 64 cm² ; A_totale = 96 cm² ; V = 64 cm³.</w:t>
             </w:r>
           </w:p>
           <w:p>
@@ -2211,7 +2343,7 @@
           <w:p>
             <w:pPr>
               <w:shd w:fill="EEF4F8" w:val="clear"/>
-              <w:spacing w:after="55" w:before="0" w:line="285"/>
+              <w:spacing w:after="3" w:before="0" w:line="285"/>
               <w:jc w:val="left"/>
             </w:pPr>
             <w:r>
@@ -2235,8 +2367,74 @@
                 <w:i w:val="false"/>
                 <w:iCs w:val="false"/>
                 <w:color w:val="A61C00"/>
-                <w:sz w:val="26"/>
-                <w:szCs w:val="26"/>
+                <w:sz w:val="24"/>
+                <w:szCs w:val="24"/>
+              </w:rPr>
+              <w:t xml:space="preserve">A_latérale = 2 × (L + l) × h</w:t>
+            </w:r>
+          </w:p>
+          <w:p>
+            <w:pPr>
+              <w:shd w:fill="EEF4F8" w:val="clear"/>
+              <w:spacing w:after="3" w:before="0" w:line="285"/>
+              <w:jc w:val="left"/>
+            </w:pPr>
+            <w:r>
+              <w:rPr>
+                <w:rFonts w:ascii="Times New Roman" w:cs="Times New Roman" w:eastAsia="Times New Roman" w:hAnsi="Times New Roman"/>
+                <w:b/>
+                <w:bCs/>
+                <w:i w:val="false"/>
+                <w:iCs w:val="false"/>
+                <w:color w:val="1F4E79"/>
+                <w:sz w:val="23"/>
+                <w:szCs w:val="23"/>
+              </w:rPr>
+              <w:t xml:space="preserve">                 </w:t>
+            </w:r>
+            <w:r>
+              <w:rPr>
+                <w:rFonts w:ascii="Times New Roman" w:cs="Times New Roman" w:eastAsia="Times New Roman" w:hAnsi="Times New Roman"/>
+                <w:b/>
+                <w:bCs/>
+                <w:i w:val="false"/>
+                <w:iCs w:val="false"/>
+                <w:color w:val="A61C00"/>
+                <w:sz w:val="24"/>
+                <w:szCs w:val="24"/>
+              </w:rPr>
+              <w:t xml:space="preserve">A_totale = 2 × (L × l + L × h + l × h)</w:t>
+            </w:r>
+          </w:p>
+          <w:p>
+            <w:pPr>
+              <w:shd w:fill="EEF4F8" w:val="clear"/>
+              <w:spacing w:after="3" w:before="0" w:line="285"/>
+              <w:jc w:val="left"/>
+            </w:pPr>
+            <w:r>
+              <w:rPr>
+                <w:rFonts w:ascii="Times New Roman" w:cs="Times New Roman" w:eastAsia="Times New Roman" w:hAnsi="Times New Roman"/>
+                <w:b/>
+                <w:bCs/>
+                <w:i w:val="false"/>
+                <w:iCs w:val="false"/>
+                <w:color w:val="1F4E79"/>
+                <w:sz w:val="23"/>
+                <w:szCs w:val="23"/>
+              </w:rPr>
+              <w:t xml:space="preserve">                 </w:t>
+            </w:r>
+            <w:r>
+              <w:rPr>
+                <w:rFonts w:ascii="Times New Roman" w:cs="Times New Roman" w:eastAsia="Times New Roman" w:hAnsi="Times New Roman"/>
+                <w:b/>
+                <w:bCs/>
+                <w:i w:val="false"/>
+                <w:iCs w:val="false"/>
+                <w:color w:val="A61C00"/>
+                <w:sz w:val="24"/>
+                <w:szCs w:val="24"/>
               </w:rPr>
               <w:t xml:space="preserve">V = L × l × h</w:t>
             </w:r>
@@ -2271,7 +2469,7 @@
                 <w:sz w:val="23"/>
                 <w:szCs w:val="23"/>
               </w:rPr>
-              <w:t xml:space="preserve">L, l et h en cm ou m ; V en cm³ ou m³.</w:t>
+              <w:t xml:space="preserve">L, l et h en cm ou m ; aires en cm² ou m² ; V en cm³ ou m³.</w:t>
             </w:r>
           </w:p>
           <w:p>
@@ -2304,7 +2502,7 @@
                 <w:sz w:val="23"/>
                 <w:szCs w:val="23"/>
               </w:rPr>
-              <w:t xml:space="preserve">Si L = 8 cm, l = 3 cm et h = 2 cm : V = 48 cm³.</w:t>
+              <w:t xml:space="preserve">Si L = 8 cm, l = 3 cm et h = 2 cm : A_latérale = 44 cm² ; A_totale = 92 cm² ; V = 48 cm³.</w:t>
             </w:r>
           </w:p>
           <w:p>
@@ -2324,7 +2522,7 @@
                 <w:sz w:val="19"/>
                 <w:szCs w:val="19"/>
               </w:rPr>
-              <w:t xml:space="preserve">Pour retrouver une dimension : L = V ÷ (l × h).</w:t>
+              <w:t xml:space="preserve">La base est le rectangle L × l ; l’aire latérale entoure cette base.</w:t>
             </w:r>
           </w:p>
         </w:tc>
@@ -2384,7 +2582,7 @@
                 <w:sz w:val="27"/>
                 <w:szCs w:val="27"/>
               </w:rPr>
-              <w:t xml:space="preserve">Prisme</w:t>
+              <w:t xml:space="preserve">Prisme droit</w:t>
             </w:r>
           </w:p>
           <w:p>
@@ -2403,7 +2601,7 @@
                 <w:sz w:val="19"/>
                 <w:szCs w:val="19"/>
               </w:rPr>
-              <w:t xml:space="preserve">Aire de la base et hauteur du prisme.</w:t>
+              <w:t xml:space="preserve">Aire et périmètre de la base, puis hauteur du prisme.</w:t>
             </w:r>
           </w:p>
           <w:p>
@@ -2455,7 +2653,7 @@
           <w:p>
             <w:pPr>
               <w:shd w:fill="EEF4F8" w:val="clear"/>
-              <w:spacing w:after="55" w:before="0" w:line="285"/>
+              <w:spacing w:after="3" w:before="0" w:line="285"/>
               <w:jc w:val="left"/>
             </w:pPr>
             <w:r>
@@ -2479,8 +2677,74 @@
                 <w:i w:val="false"/>
                 <w:iCs w:val="false"/>
                 <w:color w:val="A61C00"/>
-                <w:sz w:val="26"/>
-                <w:szCs w:val="26"/>
+                <w:sz w:val="24"/>
+                <w:szCs w:val="24"/>
+              </w:rPr>
+              <w:t xml:space="preserve">A_latérale = P_base × h</w:t>
+            </w:r>
+          </w:p>
+          <w:p>
+            <w:pPr>
+              <w:shd w:fill="EEF4F8" w:val="clear"/>
+              <w:spacing w:after="3" w:before="0" w:line="285"/>
+              <w:jc w:val="left"/>
+            </w:pPr>
+            <w:r>
+              <w:rPr>
+                <w:rFonts w:ascii="Times New Roman" w:cs="Times New Roman" w:eastAsia="Times New Roman" w:hAnsi="Times New Roman"/>
+                <w:b/>
+                <w:bCs/>
+                <w:i w:val="false"/>
+                <w:iCs w:val="false"/>
+                <w:color w:val="1F4E79"/>
+                <w:sz w:val="23"/>
+                <w:szCs w:val="23"/>
+              </w:rPr>
+              <w:t xml:space="preserve">                 </w:t>
+            </w:r>
+            <w:r>
+              <w:rPr>
+                <w:rFonts w:ascii="Times New Roman" w:cs="Times New Roman" w:eastAsia="Times New Roman" w:hAnsi="Times New Roman"/>
+                <w:b/>
+                <w:bCs/>
+                <w:i w:val="false"/>
+                <w:iCs w:val="false"/>
+                <w:color w:val="A61C00"/>
+                <w:sz w:val="24"/>
+                <w:szCs w:val="24"/>
+              </w:rPr>
+              <w:t xml:space="preserve">A_totale = A_latérale + 2 × A_base</w:t>
+            </w:r>
+          </w:p>
+          <w:p>
+            <w:pPr>
+              <w:shd w:fill="EEF4F8" w:val="clear"/>
+              <w:spacing w:after="3" w:before="0" w:line="285"/>
+              <w:jc w:val="left"/>
+            </w:pPr>
+            <w:r>
+              <w:rPr>
+                <w:rFonts w:ascii="Times New Roman" w:cs="Times New Roman" w:eastAsia="Times New Roman" w:hAnsi="Times New Roman"/>
+                <w:b/>
+                <w:bCs/>
+                <w:i w:val="false"/>
+                <w:iCs w:val="false"/>
+                <w:color w:val="1F4E79"/>
+                <w:sz w:val="23"/>
+                <w:szCs w:val="23"/>
+              </w:rPr>
+              <w:t xml:space="preserve">                 </w:t>
+            </w:r>
+            <w:r>
+              <w:rPr>
+                <w:rFonts w:ascii="Times New Roman" w:cs="Times New Roman" w:eastAsia="Times New Roman" w:hAnsi="Times New Roman"/>
+                <w:b/>
+                <w:bCs/>
+                <w:i w:val="false"/>
+                <w:iCs w:val="false"/>
+                <w:color w:val="A61C00"/>
+                <w:sz w:val="24"/>
+                <w:szCs w:val="24"/>
               </w:rPr>
               <w:t xml:space="preserve">V = A_base × h</w:t>
             </w:r>
@@ -2515,7 +2779,7 @@
                 <w:sz w:val="23"/>
                 <w:szCs w:val="23"/>
               </w:rPr>
-              <w:t xml:space="preserve">A_base en cm² ou m² ; h en cm ou m ; V en cm³ ou m³.</w:t>
+              <w:t xml:space="preserve">P_base en cm ou m ; A_base, A_latérale et A_totale en cm² ou m² ; V en cm³ ou m³.</w:t>
             </w:r>
           </w:p>
           <w:p>
@@ -2548,7 +2812,7 @@
                 <w:sz w:val="23"/>
                 <w:szCs w:val="23"/>
               </w:rPr>
-              <w:t xml:space="preserve">Si A_base = 12 cm² et h = 5 cm : V = 60 cm³.</w:t>
+              <w:t xml:space="preserve">Si P_base = 14 cm, A_base = 12 cm² et h = 5 cm : A_latérale = 70 cm² ; A_totale = 94 cm² ; V = 60 cm³.</w:t>
             </w:r>
           </w:p>
           <w:p>
@@ -2694,7 +2958,7 @@
           <w:p>
             <w:pPr>
               <w:shd w:fill="EEF4F8" w:val="clear"/>
-              <w:spacing w:after="55" w:before="0" w:line="285"/>
+              <w:spacing w:after="3" w:before="0" w:line="285"/>
               <w:jc w:val="left"/>
             </w:pPr>
             <w:r>
@@ -2718,8 +2982,74 @@
                 <w:i w:val="false"/>
                 <w:iCs w:val="false"/>
                 <w:color w:val="A61C00"/>
-                <w:sz w:val="26"/>
-                <w:szCs w:val="26"/>
+                <w:sz w:val="24"/>
+                <w:szCs w:val="24"/>
+              </w:rPr>
+              <w:t xml:space="preserve">A_latérale = 2 × π × r × h</w:t>
+            </w:r>
+          </w:p>
+          <w:p>
+            <w:pPr>
+              <w:shd w:fill="EEF4F8" w:val="clear"/>
+              <w:spacing w:after="3" w:before="0" w:line="285"/>
+              <w:jc w:val="left"/>
+            </w:pPr>
+            <w:r>
+              <w:rPr>
+                <w:rFonts w:ascii="Times New Roman" w:cs="Times New Roman" w:eastAsia="Times New Roman" w:hAnsi="Times New Roman"/>
+                <w:b/>
+                <w:bCs/>
+                <w:i w:val="false"/>
+                <w:iCs w:val="false"/>
+                <w:color w:val="1F4E79"/>
+                <w:sz w:val="23"/>
+                <w:szCs w:val="23"/>
+              </w:rPr>
+              <w:t xml:space="preserve">                 </w:t>
+            </w:r>
+            <w:r>
+              <w:rPr>
+                <w:rFonts w:ascii="Times New Roman" w:cs="Times New Roman" w:eastAsia="Times New Roman" w:hAnsi="Times New Roman"/>
+                <w:b/>
+                <w:bCs/>
+                <w:i w:val="false"/>
+                <w:iCs w:val="false"/>
+                <w:color w:val="A61C00"/>
+                <w:sz w:val="24"/>
+                <w:szCs w:val="24"/>
+              </w:rPr>
+              <w:t xml:space="preserve">A_totale = A_latérale + 2 × π × r²</w:t>
+            </w:r>
+          </w:p>
+          <w:p>
+            <w:pPr>
+              <w:shd w:fill="EEF4F8" w:val="clear"/>
+              <w:spacing w:after="3" w:before="0" w:line="285"/>
+              <w:jc w:val="left"/>
+            </w:pPr>
+            <w:r>
+              <w:rPr>
+                <w:rFonts w:ascii="Times New Roman" w:cs="Times New Roman" w:eastAsia="Times New Roman" w:hAnsi="Times New Roman"/>
+                <w:b/>
+                <w:bCs/>
+                <w:i w:val="false"/>
+                <w:iCs w:val="false"/>
+                <w:color w:val="1F4E79"/>
+                <w:sz w:val="23"/>
+                <w:szCs w:val="23"/>
+              </w:rPr>
+              <w:t xml:space="preserve">                 </w:t>
+            </w:r>
+            <w:r>
+              <w:rPr>
+                <w:rFonts w:ascii="Times New Roman" w:cs="Times New Roman" w:eastAsia="Times New Roman" w:hAnsi="Times New Roman"/>
+                <w:b/>
+                <w:bCs/>
+                <w:i w:val="false"/>
+                <w:iCs w:val="false"/>
+                <w:color w:val="A61C00"/>
+                <w:sz w:val="24"/>
+                <w:szCs w:val="24"/>
               </w:rPr>
               <w:t xml:space="preserve">V = π × r² × h</w:t>
             </w:r>
@@ -2754,7 +3084,7 @@
                 <w:sz w:val="23"/>
                 <w:szCs w:val="23"/>
               </w:rPr>
-              <w:t xml:space="preserve">r et h en cm ou m ; V en cm³ ou m³.</w:t>
+              <w:t xml:space="preserve">r et h en cm ou m ; aires en cm² ou m² ; V en cm³ ou m³.</w:t>
             </w:r>
           </w:p>
           <w:p>
@@ -2787,7 +3117,7 @@
                 <w:sz w:val="23"/>
                 <w:szCs w:val="23"/>
               </w:rPr>
-              <w:t xml:space="preserve">Si r = 2 cm et h = 5 cm : V ≈ 3,14 × 4 × 5 = 62,8 cm³.</w:t>
+              <w:t xml:space="preserve">Si r = 2 cm et h = 5 cm : A_latérale ≈ 62,8 cm² ; A_totale ≈ 87,92 cm² ; V ≈ 62,8 cm³.</w:t>
             </w:r>
           </w:p>
           <w:p>
@@ -2976,7 +3306,7 @@
           <w:p>
             <w:pPr>
               <w:shd w:fill="EEF4F8" w:val="clear"/>
-              <w:spacing w:after="55" w:before="0" w:line="285"/>
+              <w:spacing w:after="3" w:before="0" w:line="285"/>
               <w:jc w:val="left"/>
             </w:pPr>
             <w:r>
@@ -3000,8 +3330,8 @@
                 <w:i w:val="false"/>
                 <w:iCs w:val="false"/>
                 <w:color w:val="A61C00"/>
-                <w:sz w:val="26"/>
-                <w:szCs w:val="26"/>
+                <w:sz w:val="24"/>
+                <w:szCs w:val="24"/>
               </w:rPr>
               <w:t xml:space="preserve">Triangle : 180° ;   quadrilatère : 360°</w:t>
             </w:r>
@@ -3215,7 +3545,7 @@
           <w:p>
             <w:pPr>
               <w:shd w:fill="EEF4F8" w:val="clear"/>
-              <w:spacing w:after="55" w:before="0" w:line="285"/>
+              <w:spacing w:after="3" w:before="0" w:line="285"/>
               <w:jc w:val="left"/>
             </w:pPr>
             <w:r>
@@ -3239,8 +3569,8 @@
                 <w:i w:val="false"/>
                 <w:iCs w:val="false"/>
                 <w:color w:val="A61C00"/>
-                <w:sz w:val="26"/>
-                <w:szCs w:val="26"/>
+                <w:sz w:val="24"/>
+                <w:szCs w:val="24"/>
               </w:rPr>
               <w:t xml:space="preserve">Longueur / périmètre : cm ou m ; aire : cm² ou m² ; volume : cm³ ou m³</w:t>
             </w:r>

</xml_diff>